<commit_message>
new code and otchet
</commit_message>
<xml_diff>
--- a/ОтчётИсходник.docx
+++ b/ОтчётИсходник.docx
@@ -404,7 +404,7 @@
           <w:rFonts w:asciiTheme="minorHAnsi" w:hAnsiTheme="minorHAnsi" w:cstheme="minorHAnsi"/>
           <w:sz w:val="32"/>
         </w:rPr>
-        <w:t>5</w:t>
+        <w:t>6</w:t>
       </w:r>
     </w:p>
     <w:p>
@@ -441,27 +441,15 @@
           <w:sz w:val="32"/>
           <w:szCs w:val="32"/>
         </w:rPr>
-        <w:t>Корреляционный анализ и</w:t>
-      </w:r>
-    </w:p>
-    <w:p>
-      <w:pPr>
-        <w:spacing w:line="259" w:lineRule="auto"/>
-        <w:ind w:left="690" w:right="695"/>
-        <w:jc w:val="center"/>
+        <w:t>Л</w:t>
+      </w:r>
+      <w:r>
         <w:rPr>
           <w:rFonts w:asciiTheme="minorHAnsi" w:hAnsiTheme="minorHAnsi" w:cstheme="minorHAnsi"/>
           <w:sz w:val="32"/>
           <w:szCs w:val="32"/>
         </w:rPr>
-      </w:pPr>
-      <w:r>
-        <w:rPr>
-          <w:rFonts w:asciiTheme="minorHAnsi" w:hAnsiTheme="minorHAnsi" w:cstheme="minorHAnsi"/>
-          <w:sz w:val="32"/>
-          <w:szCs w:val="32"/>
-        </w:rPr>
-        <w:t>эллипсы рассеивания</w:t>
+        <w:t>инейная регрессия. Метод наименьших квадратов и наименьших модулей</w:t>
       </w:r>
       <w:r>
         <w:rPr>
@@ -2853,13 +2841,7 @@
         <w:ind w:firstLine="708"/>
       </w:pPr>
       <w:r>
-        <w:t xml:space="preserve">Изучить способы визуализации </w:t>
-      </w:r>
-      <w:r>
-        <w:t xml:space="preserve">ковариационных </w:t>
-      </w:r>
-      <w:r>
-        <w:t>данных.</w:t>
+        <w:t>Изучить способы визуализации ковариационных данных.</w:t>
       </w:r>
     </w:p>
     <w:p>
@@ -3058,13 +3040,7 @@
                 <w:rPr>
                   <w:rFonts w:ascii="Cambria Math" w:hAnsi="Cambria Math"/>
                 </w:rPr>
-                <m:t>0,0,1,1,</m:t>
-              </m:r>
-              <m:r>
-                <w:rPr>
-                  <w:rFonts w:ascii="Cambria Math" w:hAnsi="Cambria Math"/>
-                </w:rPr>
-                <m:t>ρ</m:t>
+                <m:t>0,0,1,1,ρ</m:t>
               </m:r>
             </m:e>
           </m:d>
@@ -3101,13 +3077,7 @@
                 <w:rPr>
                   <w:rFonts w:ascii="Cambria Math" w:hAnsi="Cambria Math"/>
                 </w:rPr>
-                <m:t>2</m:t>
-              </m:r>
-              <m:r>
-                <w:rPr>
-                  <w:rFonts w:ascii="Cambria Math" w:hAnsi="Cambria Math"/>
-                </w:rPr>
-                <m:t>π</m:t>
+                <m:t>2π</m:t>
               </m:r>
               <m:rad>
                 <m:radPr>
@@ -3249,19 +3219,7 @@
                         <w:rPr>
                           <w:rFonts w:ascii="Cambria Math" w:hAnsi="Cambria Math"/>
                         </w:rPr>
-                        <m:t>-2</m:t>
-                      </m:r>
-                      <m:r>
-                        <w:rPr>
-                          <w:rFonts w:ascii="Cambria Math" w:hAnsi="Cambria Math"/>
-                        </w:rPr>
-                        <m:t>ρ</m:t>
-                      </m:r>
-                      <m:r>
-                        <w:rPr>
-                          <w:rFonts w:ascii="Cambria Math" w:hAnsi="Cambria Math"/>
-                        </w:rPr>
-                        <m:t>xy+</m:t>
+                        <m:t>-2ρxy+</m:t>
                       </m:r>
                       <m:sSup>
                         <m:sSupPr>
@@ -5034,14 +4992,7 @@
           <w:rFonts w:asciiTheme="majorHAnsi" w:eastAsia="Times New Roman" w:hAnsiTheme="majorHAnsi" w:cstheme="majorHAnsi"/>
           <w:lang w:eastAsia="ru-RU"/>
         </w:rPr>
-        <w:t xml:space="preserve"> </w:t>
-      </w:r>
-      <w:r>
-        <w:rPr>
-          <w:rFonts w:asciiTheme="majorHAnsi" w:eastAsia="Times New Roman" w:hAnsiTheme="majorHAnsi" w:cstheme="majorHAnsi"/>
-          <w:lang w:eastAsia="ru-RU"/>
-        </w:rPr>
-        <w:t>— ранги i-</w:t>
+        <w:t xml:space="preserve"> — ранги i-</w:t>
       </w:r>
       <w:proofErr w:type="spellStart"/>
       <w:r>
@@ -5115,14 +5066,7 @@
           <w:rFonts w:asciiTheme="majorHAnsi" w:eastAsia="Times New Roman" w:hAnsiTheme="majorHAnsi" w:cstheme="majorHAnsi"/>
           <w:lang w:eastAsia="ru-RU"/>
         </w:rPr>
-        <w:t xml:space="preserve"> </w:t>
-      </w:r>
-      <w:r>
-        <w:rPr>
-          <w:rFonts w:asciiTheme="majorHAnsi" w:eastAsia="Times New Roman" w:hAnsiTheme="majorHAnsi" w:cstheme="majorHAnsi"/>
-          <w:lang w:eastAsia="ru-RU"/>
-        </w:rPr>
-        <w:t>— средние значения рангов.</w:t>
+        <w:t xml:space="preserve"> — средние значения рангов.</w:t>
       </w:r>
     </w:p>
     <w:p>
@@ -6082,16 +6026,7 @@
         <w:jc w:val="center"/>
       </w:pPr>
       <w:r>
-        <w:t>Коэффициент</w:t>
-      </w:r>
-      <w:r>
-        <w:t xml:space="preserve"> </w:t>
-      </w:r>
-      <w:r>
-        <w:t>Пирсон</w:t>
-      </w:r>
-      <w:r>
-        <w:t>а</w:t>
+        <w:t>Коэффициент Пирсона</w:t>
       </w:r>
     </w:p>
     <w:tbl>
@@ -6105,13 +6040,13 @@
         <w:tblLook w:val="04A0" w:firstRow="1" w:lastRow="0" w:firstColumn="1" w:lastColumn="0" w:noHBand="0" w:noVBand="1"/>
       </w:tblPr>
       <w:tblGrid>
-        <w:gridCol w:w="424"/>
-        <w:gridCol w:w="988"/>
-        <w:gridCol w:w="887"/>
+        <w:gridCol w:w="428"/>
+        <w:gridCol w:w="987"/>
+        <w:gridCol w:w="886"/>
         <w:gridCol w:w="1140"/>
-        <w:gridCol w:w="1039"/>
+        <w:gridCol w:w="1038"/>
         <w:gridCol w:w="1140"/>
-        <w:gridCol w:w="1039"/>
+        <w:gridCol w:w="1038"/>
       </w:tblGrid>
       <w:tr>
         <w:trPr>
@@ -7710,12 +7645,12 @@
       </w:tblPr>
       <w:tblGrid>
         <w:gridCol w:w="424"/>
-        <w:gridCol w:w="875"/>
-        <w:gridCol w:w="879"/>
-        <w:gridCol w:w="1027"/>
+        <w:gridCol w:w="878"/>
+        <w:gridCol w:w="882"/>
         <w:gridCol w:w="1030"/>
-        <w:gridCol w:w="1036"/>
-        <w:gridCol w:w="1039"/>
+        <w:gridCol w:w="1033"/>
+        <w:gridCol w:w="1030"/>
+        <w:gridCol w:w="1033"/>
       </w:tblGrid>
       <w:tr>
         <w:trPr>
@@ -9303,9 +9238,9 @@
         <w:tblLook w:val="04A0" w:firstRow="1" w:lastRow="0" w:firstColumn="1" w:lastColumn="0" w:noHBand="0" w:noVBand="1"/>
       </w:tblPr>
       <w:tblGrid>
-        <w:gridCol w:w="424"/>
-        <w:gridCol w:w="926"/>
-        <w:gridCol w:w="887"/>
+        <w:gridCol w:w="427"/>
+        <w:gridCol w:w="924"/>
+        <w:gridCol w:w="886"/>
         <w:gridCol w:w="1078"/>
         <w:gridCol w:w="1039"/>
         <w:gridCol w:w="1078"/>
@@ -10936,16 +10871,7 @@
         <w:jc w:val="center"/>
       </w:pPr>
       <w:r>
-        <w:t xml:space="preserve">Рис </w:t>
-      </w:r>
-      <w:r>
-        <w:t>2</w:t>
-      </w:r>
-      <w:r>
-        <w:t>. Эллипс рассеяния для двумерного нормального распределения</w:t>
-      </w:r>
-      <w:r>
-        <w:t xml:space="preserve"> при размере выборки 20</w:t>
+        <w:t>Рис 2. Эллипс рассеяния для двумерного нормального распределения при размере выборки 20</w:t>
       </w:r>
     </w:p>
     <w:p>
@@ -11027,25 +10953,7 @@
         <w:jc w:val="center"/>
       </w:pPr>
       <w:r>
-        <w:t xml:space="preserve">Рис </w:t>
-      </w:r>
-      <w:r>
-        <w:t>3</w:t>
-      </w:r>
-      <w:r>
-        <w:t>. Эллипс рассеяния для двумерного нормального распределения</w:t>
-      </w:r>
-      <w:r>
-        <w:t xml:space="preserve"> </w:t>
-      </w:r>
-      <w:r>
-        <w:t xml:space="preserve">при размере выборки </w:t>
-      </w:r>
-      <w:r>
-        <w:t>6</w:t>
-      </w:r>
-      <w:r>
-        <w:t>0</w:t>
+        <w:t>Рис 3. Эллипс рассеяния для двумерного нормального распределения при размере выборки 60</w:t>
       </w:r>
     </w:p>
     <w:p>
@@ -11128,25 +11036,7 @@
         <w:jc w:val="center"/>
       </w:pPr>
       <w:r>
-        <w:t xml:space="preserve">Рис </w:t>
-      </w:r>
-      <w:r>
-        <w:t>4.</w:t>
-      </w:r>
-      <w:r>
-        <w:t xml:space="preserve"> Эллипс рассеяния для двумерного нормального распределения</w:t>
-      </w:r>
-      <w:r>
-        <w:t xml:space="preserve"> </w:t>
-      </w:r>
-      <w:r>
-        <w:t xml:space="preserve">при размере выборки </w:t>
-      </w:r>
-      <w:r>
-        <w:t>10</w:t>
-      </w:r>
-      <w:r>
-        <w:t>0</w:t>
+        <w:t>Рис 4. Эллипс рассеяния для двумерного нормального распределения при размере выборки 100</w:t>
       </w:r>
     </w:p>
     <w:p>
@@ -13049,19 +12939,7 @@
         <w:jc w:val="center"/>
       </w:pPr>
       <w:r>
-        <w:t xml:space="preserve">Рис </w:t>
-      </w:r>
-      <w:r>
-        <w:t>5</w:t>
-      </w:r>
-      <w:r>
-        <w:t>. Эллипс рассеяния для смеси распределений</w:t>
-      </w:r>
-      <w:r>
-        <w:t xml:space="preserve"> </w:t>
-      </w:r>
-      <w:r>
-        <w:t>при размере выборки 20</w:t>
+        <w:t>Рис 5. Эллипс рассеяния для смеси распределений при размере выборки 20</w:t>
       </w:r>
     </w:p>
     <w:p>
@@ -13141,19 +13019,7 @@
         <w:jc w:val="center"/>
       </w:pPr>
       <w:r>
-        <w:t xml:space="preserve">Рис </w:t>
-      </w:r>
-      <w:r>
-        <w:t>6</w:t>
-      </w:r>
-      <w:r>
-        <w:t>. Эллипс рассеяния для смеси распределений</w:t>
-      </w:r>
-      <w:r>
-        <w:t xml:space="preserve"> </w:t>
-      </w:r>
-      <w:r>
-        <w:t>при размере выборки 60</w:t>
+        <w:t>Рис 6. Эллипс рассеяния для смеси распределений при размере выборки 60</w:t>
       </w:r>
     </w:p>
     <w:p>
@@ -13235,19 +13101,7 @@
         <w:jc w:val="center"/>
       </w:pPr>
       <w:r>
-        <w:t xml:space="preserve">Рис </w:t>
-      </w:r>
-      <w:r>
-        <w:t>7.</w:t>
-      </w:r>
-      <w:r>
-        <w:t xml:space="preserve"> Эллипс рассеяния для смеси распределений</w:t>
-      </w:r>
-      <w:r>
-        <w:t xml:space="preserve"> </w:t>
-      </w:r>
-      <w:r>
-        <w:t>при размере выборки 100</w:t>
+        <w:t>Рис 7. Эллипс рассеяния для смеси распределений при размере выборки 100</w:t>
       </w:r>
     </w:p>
     <w:p/>
@@ -13293,18 +13147,10 @@
       </w:r>
     </w:p>
     <w:p>
-      <w:pPr>
-        <w:rPr>
-          <w:lang w:val="en-US"/>
-        </w:rPr>
-      </w:pPr>
       <w:r>
         <w:t>Двумерное нормальное распределение</w:t>
       </w:r>
       <w:r>
-        <w:rPr>
-          <w:lang w:val="en-US"/>
-        </w:rPr>
         <w:t>:</w:t>
       </w:r>
     </w:p>
@@ -13528,13 +13374,7 @@
           <w:rPr>
             <w:rFonts w:ascii="Cambria Math" w:hAnsi="Cambria Math"/>
           </w:rPr>
-          <m:t>= 0.</m:t>
-        </m:r>
-        <m:r>
-          <w:rPr>
-            <w:rFonts w:ascii="Cambria Math" w:hAnsi="Cambria Math"/>
-          </w:rPr>
-          <m:t>9</m:t>
+          <m:t>= 0.9</m:t>
         </m:r>
       </m:oMath>
       <w:r>

</xml_diff>

<commit_message>
New code for lab7 and small changes in report
</commit_message>
<xml_diff>
--- a/ОтчётИсходник.docx
+++ b/ОтчётИсходник.docx
@@ -404,7 +404,7 @@
           <w:rFonts w:asciiTheme="minorHAnsi" w:hAnsiTheme="minorHAnsi" w:cstheme="minorHAnsi"/>
           <w:sz w:val="32"/>
         </w:rPr>
-        <w:t>6</w:t>
+        <w:t>7</w:t>
       </w:r>
     </w:p>
     <w:p>
@@ -441,15 +441,44 @@
           <w:sz w:val="32"/>
           <w:szCs w:val="32"/>
         </w:rPr>
-        <w:t>Л</w:t>
-      </w:r>
-      <w:r>
+        <w:t>Проверка гипотез о законе</w:t>
+      </w:r>
+    </w:p>
+    <w:p>
+      <w:pPr>
+        <w:spacing w:line="259" w:lineRule="auto"/>
+        <w:ind w:left="690" w:right="695"/>
+        <w:jc w:val="center"/>
         <w:rPr>
           <w:rFonts w:asciiTheme="minorHAnsi" w:hAnsiTheme="minorHAnsi" w:cstheme="minorHAnsi"/>
           <w:sz w:val="32"/>
           <w:szCs w:val="32"/>
         </w:rPr>
-        <w:t>инейная регрессия. Метод наименьших квадратов и наименьших модулей</w:t>
+      </w:pPr>
+      <w:r>
+        <w:rPr>
+          <w:rFonts w:asciiTheme="minorHAnsi" w:hAnsiTheme="minorHAnsi" w:cstheme="minorHAnsi"/>
+          <w:sz w:val="32"/>
+          <w:szCs w:val="32"/>
+        </w:rPr>
+        <w:t xml:space="preserve">распределения. Критерий </w:t>
+      </w:r>
+      <w:r>
+        <w:rPr>
+          <w:rFonts w:ascii="Cambria Math" w:hAnsi="Cambria Math" w:cs="Cambria Math"/>
+          <w:sz w:val="32"/>
+          <w:szCs w:val="32"/>
+        </w:rPr>
+        <w:t>𝜒</w:t>
+      </w:r>
+      <w:r>
+        <w:rPr>
+          <w:rFonts w:ascii="Cambria Math" w:hAnsi="Cambria Math" w:cs="Cambria Math"/>
+          <w:sz w:val="32"/>
+          <w:szCs w:val="32"/>
+          <w:vertAlign w:val="superscript"/>
+        </w:rPr>
+        <w:t>2</w:t>
       </w:r>
       <w:r>
         <w:rPr>
@@ -2354,21 +2383,54 @@
     <w:p>
       <w:pPr>
         <w:ind w:firstLine="708"/>
-      </w:pPr>
-      <w:r>
-        <w:t>Сравнить</w:t>
-      </w:r>
-      <w:r>
-        <w:t xml:space="preserve"> </w:t>
-      </w:r>
-      <w:r>
-        <w:t>метод наименьших квадратов (МНК) и метод</w:t>
-      </w:r>
-      <w:r>
-        <w:t xml:space="preserve"> </w:t>
-      </w:r>
-      <w:r>
-        <w:t>наименьших модулей (МНМ)</w:t>
+        <w:rPr>
+          <w:lang w:val="en-US"/>
+        </w:rPr>
+      </w:pPr>
+      <w:r>
+        <w:t xml:space="preserve">Исследование критерия </w:t>
+      </w:r>
+      <m:oMath>
+        <m:sSup>
+          <m:sSupPr>
+            <m:ctrlPr>
+              <w:rPr>
+                <w:rFonts w:ascii="Cambria Math" w:hAnsi="Cambria Math"/>
+                <w:i/>
+              </w:rPr>
+            </m:ctrlPr>
+          </m:sSupPr>
+          <m:e>
+            <m:r>
+              <m:rPr>
+                <m:sty m:val="p"/>
+              </m:rPr>
+              <w:rPr>
+                <w:rFonts w:ascii="Cambria Math" w:hAnsi="Cambria Math"/>
+              </w:rPr>
+              <m:t>χ</m:t>
+            </m:r>
+            <m:ctrlPr>
+              <w:rPr>
+                <w:rFonts w:ascii="Cambria Math" w:hAnsi="Cambria Math"/>
+              </w:rPr>
+            </m:ctrlPr>
+          </m:e>
+          <m:sup>
+            <m:r>
+              <w:rPr>
+                <w:rFonts w:ascii="Cambria Math" w:hAnsi="Cambria Math"/>
+              </w:rPr>
+              <m:t>2</m:t>
+            </m:r>
+          </m:sup>
+        </m:sSup>
+      </m:oMath>
+      <w:r>
+        <w:rPr>
+          <w:lang w:val="en-US"/>
+        </w:rPr>
+        <w:t>.</w:t>
       </w:r>
     </w:p>
     <w:p>
@@ -2400,7 +2462,43 @@
         <w:rPr>
           <w:lang w:eastAsia="ru-RU"/>
         </w:rPr>
-        <w:t>Сгенерировать базовую выборку с линейной зависимостью и добавлением нормально распределенного шума.</w:t>
+        <w:t xml:space="preserve">Сгенерировать </w:t>
+      </w:r>
+      <w:r>
+        <w:rPr>
+          <w:lang w:eastAsia="ru-RU"/>
+        </w:rPr>
+        <w:t>выборки из распределений нормального</w:t>
+      </w:r>
+      <w:r>
+        <w:rPr>
+          <w:lang w:eastAsia="ru-RU"/>
+        </w:rPr>
+        <w:t xml:space="preserve">, </w:t>
+      </w:r>
+      <w:r>
+        <w:rPr>
+          <w:lang w:eastAsia="ru-RU"/>
+        </w:rPr>
+        <w:t>Лапласа</w:t>
+      </w:r>
+      <w:r>
+        <w:rPr>
+          <w:lang w:eastAsia="ru-RU"/>
+        </w:rPr>
+        <w:t xml:space="preserve"> </w:t>
+      </w:r>
+      <w:r>
+        <w:rPr>
+          <w:lang w:eastAsia="ru-RU"/>
+        </w:rPr>
+        <w:t>и равномерного</w:t>
+      </w:r>
+      <w:r>
+        <w:rPr>
+          <w:lang w:eastAsia="ru-RU"/>
+        </w:rPr>
+        <w:t>.</w:t>
       </w:r>
     </w:p>
     <w:p>
@@ -2418,37 +2516,7 @@
         <w:rPr>
           <w:lang w:eastAsia="ru-RU"/>
         </w:rPr>
-        <w:t>Создать выборку с и</w:t>
-      </w:r>
-      <w:r>
-        <w:rPr>
-          <w:lang w:eastAsia="ru-RU"/>
-        </w:rPr>
-        <w:t>скусственно внес</w:t>
-      </w:r>
-      <w:r>
-        <w:rPr>
-          <w:lang w:eastAsia="ru-RU"/>
-        </w:rPr>
-        <w:t>ёнными</w:t>
-      </w:r>
-      <w:r>
-        <w:rPr>
-          <w:lang w:eastAsia="ru-RU"/>
-        </w:rPr>
-        <w:t xml:space="preserve"> выброс</w:t>
-      </w:r>
-      <w:r>
-        <w:rPr>
-          <w:lang w:eastAsia="ru-RU"/>
-        </w:rPr>
-        <w:t>ами</w:t>
-      </w:r>
-      <w:r>
-        <w:rPr>
-          <w:lang w:eastAsia="ru-RU"/>
-        </w:rPr>
-        <w:t>.</w:t>
+        <w:t>С помощью метода максимального правдоподобия для нормального распределения рассчитать параметры получившихся выборок.</w:t>
       </w:r>
     </w:p>
     <w:p>
@@ -2466,55 +2534,58 @@
         <w:rPr>
           <w:lang w:eastAsia="ru-RU"/>
         </w:rPr>
-        <w:t>Рассчитать регрессионные коэффициенты для данных выборок с помощью МНК и МНМ</w:t>
-      </w:r>
-    </w:p>
-    <w:p>
-      <w:pPr>
-        <w:pStyle w:val="a6"/>
-        <w:numPr>
-          <w:ilvl w:val="0"/>
-          <w:numId w:val="23"/>
-        </w:numPr>
+        <w:t>Проверить гипотезу о нормальности</w:t>
+      </w:r>
+      <m:oMath>
+        <m:r>
+          <w:rPr>
+            <w:rFonts w:ascii="Cambria Math" w:hAnsi="Cambria Math"/>
+            <w:lang w:eastAsia="ru-RU"/>
+          </w:rPr>
+          <m:t xml:space="preserve"> </m:t>
+        </m:r>
+      </m:oMath>
+      <w:r>
         <w:rPr>
           <w:lang w:eastAsia="ru-RU"/>
         </w:rPr>
-      </w:pPr>
-      <w:r>
-        <w:rPr>
-          <w:lang w:eastAsia="ru-RU"/>
-        </w:rPr>
-        <w:t xml:space="preserve">Вычислить абсолютные и относительные погрешности оценок параметров для обоих методов </w:t>
-      </w:r>
-      <w:r>
-        <w:rPr>
-          <w:lang w:eastAsia="ru-RU"/>
-        </w:rPr>
-        <w:t>и выборок</w:t>
-      </w:r>
-      <w:r>
-        <w:rPr>
-          <w:lang w:eastAsia="ru-RU"/>
-        </w:rPr>
+        <w:t xml:space="preserve">для каждой выборки с помощью критерия </w:t>
+      </w:r>
+      <m:oMath>
+        <m:sSup>
+          <m:sSupPr>
+            <m:ctrlPr>
+              <w:rPr>
+                <w:rFonts w:ascii="Cambria Math" w:hAnsi="Cambria Math"/>
+                <w:i/>
+              </w:rPr>
+            </m:ctrlPr>
+          </m:sSupPr>
+          <m:e>
+            <m:r>
+              <w:rPr>
+                <w:rFonts w:ascii="Cambria Math" w:hAnsi="Cambria Math"/>
+              </w:rPr>
+              <m:t>χ</m:t>
+            </m:r>
+            <m:ctrlPr>
+              <w:rPr>
+                <w:rFonts w:ascii="Cambria Math" w:hAnsi="Cambria Math"/>
+              </w:rPr>
+            </m:ctrlPr>
+          </m:e>
+          <m:sup>
+            <m:r>
+              <w:rPr>
+                <w:rFonts w:ascii="Cambria Math" w:hAnsi="Cambria Math"/>
+              </w:rPr>
+              <m:t>2</m:t>
+            </m:r>
+          </m:sup>
+        </m:sSup>
+      </m:oMath>
+      <w:r>
         <w:t>.</w:t>
-      </w:r>
-    </w:p>
-    <w:p>
-      <w:pPr>
-        <w:pStyle w:val="a6"/>
-        <w:numPr>
-          <w:ilvl w:val="0"/>
-          <w:numId w:val="23"/>
-        </w:numPr>
-        <w:rPr>
-          <w:lang w:eastAsia="ru-RU"/>
-        </w:rPr>
-      </w:pPr>
-      <w:r>
-        <w:rPr>
-          <w:lang w:eastAsia="ru-RU"/>
-        </w:rPr>
-        <w:t>Построить графики.</w:t>
       </w:r>
     </w:p>
     <w:p>
@@ -4324,7 +4395,6 @@
           <w:sz w:val="22"/>
           <w:szCs w:val="22"/>
         </w:rPr>
-        <w:lastRenderedPageBreak/>
         <w:t>calculate_</w:t>
       </w:r>
       <w:proofErr w:type="gramStart"/>
@@ -4529,7 +4599,14 @@
         <w:rPr>
           <w:rFonts w:asciiTheme="majorHAnsi" w:hAnsiTheme="majorHAnsi" w:cstheme="majorHAnsi"/>
         </w:rPr>
-        <w:t xml:space="preserve"> – вычисленные коэффициенты, </w:t>
+        <w:t xml:space="preserve"> – вычисленные </w:t>
+      </w:r>
+      <w:r>
+        <w:rPr>
+          <w:rFonts w:asciiTheme="majorHAnsi" w:hAnsiTheme="majorHAnsi" w:cstheme="majorHAnsi"/>
+        </w:rPr>
+        <w:lastRenderedPageBreak/>
+        <w:t xml:space="preserve">коэффициенты, </w:t>
       </w:r>
       <w:proofErr w:type="spellStart"/>
       <w:r>

</xml_diff>